<commit_message>
update tata tertib pesantren
</commit_message>
<xml_diff>
--- a/atribute/TATA TERTIB SANTRI.docx
+++ b/atribute/TATA TERTIB SANTRI.docx
@@ -1,6 +1,6 @@
 
 <file path=word/document.xml><?xml version="1.0" encoding="utf-8"?>
-<w:document xmlns:wpc="http://schemas.microsoft.com/office/word/2010/wordprocessingCanvas" xmlns:cx="http://schemas.microsoft.com/office/drawing/2014/chartex" xmlns:cx1="http://schemas.microsoft.com/office/drawing/2015/9/8/chartex" xmlns:cx2="http://schemas.microsoft.com/office/drawing/2015/10/21/chartex" xmlns:cx3="http://schemas.microsoft.com/office/drawing/2016/5/9/chartex" xmlns:cx4="http://schemas.microsoft.com/office/drawing/2016/5/10/chartex" xmlns:cx5="http://schemas.microsoft.com/office/drawing/2016/5/11/chartex" xmlns:cx6="http://schemas.microsoft.com/office/drawing/2016/5/12/chartex" xmlns:cx7="http://schemas.microsoft.com/office/drawing/2016/5/13/chartex" xmlns:cx8="http://schemas.microsoft.com/office/drawing/2016/5/14/chartex" xmlns:mc="http://schemas.openxmlformats.org/markup-compatibility/2006" xmlns:aink="http://schemas.microsoft.com/office/drawing/2016/ink" xmlns:am3d="http://schemas.microsoft.com/office/drawing/2017/model3d" xmlns:o="urn:schemas-microsoft-com:office:office" xmlns:oel="http://schemas.microsoft.com/office/2019/extlst" xmlns:r="http://schemas.openxmlformats.org/officeDocument/2006/relationships" xmlns:m="http://schemas.openxmlformats.org/officeDocument/2006/math" xmlns:v="urn:schemas-microsoft-com:vml" xmlns:wp14="http://schemas.microsoft.com/office/word/2010/wordprocessingDrawing" xmlns:wp="http://schemas.openxmlformats.org/drawingml/2006/wordprocessingDrawing" xmlns:w10="urn:schemas-microsoft-com:office:word" xmlns:w="http://schemas.openxmlformats.org/wordprocessingml/2006/main" xmlns:w14="http://schemas.microsoft.com/office/word/2010/wordml" xmlns:w15="http://schemas.microsoft.com/office/word/2012/wordml" xmlns:w16cex="http://schemas.microsoft.com/office/word/2018/wordml/cex" xmlns:w16cid="http://schemas.microsoft.com/office/word/2016/wordml/cid" xmlns:w16="http://schemas.microsoft.com/office/word/2018/wordml" xmlns:w16du="http://schemas.microsoft.com/office/word/2023/wordml/word16du" xmlns:w16sdtdh="http://schemas.microsoft.com/office/word/2020/wordml/sdtdatahash" xmlns:w16se="http://schemas.microsoft.com/office/word/2015/wordml/symex" xmlns:wpg="http://schemas.microsoft.com/office/word/2010/wordprocessingGroup" xmlns:wpi="http://schemas.microsoft.com/office/word/2010/wordprocessingInk" xmlns:wne="http://schemas.microsoft.com/office/word/2006/wordml" xmlns:wps="http://schemas.microsoft.com/office/word/2010/wordprocessingShape" mc:Ignorable="w14 w15 w16se w16cid w16 w16cex w16sdtdh wp14">
+<w:document xmlns:wpc="http://schemas.microsoft.com/office/word/2010/wordprocessingCanvas" xmlns:cx="http://schemas.microsoft.com/office/drawing/2014/chartex" xmlns:cx1="http://schemas.microsoft.com/office/drawing/2015/9/8/chartex" xmlns:cx2="http://schemas.microsoft.com/office/drawing/2015/10/21/chartex" xmlns:cx3="http://schemas.microsoft.com/office/drawing/2016/5/9/chartex" xmlns:cx4="http://schemas.microsoft.com/office/drawing/2016/5/10/chartex" xmlns:cx5="http://schemas.microsoft.com/office/drawing/2016/5/11/chartex" xmlns:cx6="http://schemas.microsoft.com/office/drawing/2016/5/12/chartex" xmlns:cx7="http://schemas.microsoft.com/office/drawing/2016/5/13/chartex" xmlns:cx8="http://schemas.microsoft.com/office/drawing/2016/5/14/chartex" xmlns:mc="http://schemas.openxmlformats.org/markup-compatibility/2006" xmlns:aink="http://schemas.microsoft.com/office/drawing/2016/ink" xmlns:am3d="http://schemas.microsoft.com/office/drawing/2017/model3d" xmlns:o="urn:schemas-microsoft-com:office:office" xmlns:oel="http://schemas.microsoft.com/office/2019/extlst" xmlns:r="http://schemas.openxmlformats.org/officeDocument/2006/relationships" xmlns:m="http://schemas.openxmlformats.org/officeDocument/2006/math" xmlns:v="urn:schemas-microsoft-com:vml" xmlns:wp14="http://schemas.microsoft.com/office/word/2010/wordprocessingDrawing" xmlns:wp="http://schemas.openxmlformats.org/drawingml/2006/wordprocessingDrawing" xmlns:w10="urn:schemas-microsoft-com:office:word" xmlns:w="http://schemas.openxmlformats.org/wordprocessingml/2006/main" xmlns:w14="http://schemas.microsoft.com/office/word/2010/wordml" xmlns:w15="http://schemas.microsoft.com/office/word/2012/wordml" xmlns:w16cex="http://schemas.microsoft.com/office/word/2018/wordml/cex" xmlns:w16cid="http://schemas.microsoft.com/office/word/2016/wordml/cid" xmlns:w16="http://schemas.microsoft.com/office/word/2018/wordml" xmlns:w16du="http://schemas.microsoft.com/office/word/2023/wordml/word16du" xmlns:w16sdtdh="http://schemas.microsoft.com/office/word/2020/wordml/sdtdatahash" xmlns:w16sdtfl="http://schemas.microsoft.com/office/word/2024/wordml/sdtformatlock" xmlns:w16se="http://schemas.microsoft.com/office/word/2015/wordml/symex" xmlns:wpg="http://schemas.microsoft.com/office/word/2010/wordprocessingGroup" xmlns:wpi="http://schemas.microsoft.com/office/word/2010/wordprocessingInk" xmlns:wne="http://schemas.microsoft.com/office/word/2006/wordml" xmlns:wps="http://schemas.microsoft.com/office/word/2010/wordprocessingShape" mc:Ignorable="w14 w15 w16se w16cid w16 w16cex w16sdtdh w16sdtfl w16du wp14">
   <w:body>
     <w:tbl>
       <w:tblPr>
@@ -45,7 +45,7 @@
                 <w:lang w:eastAsia="id-ID"/>
               </w:rPr>
               <w:drawing>
-                <wp:inline distT="0" distB="0" distL="0" distR="0" wp14:anchorId="51CD5F6D" wp14:editId="00E89FAD">
+                <wp:inline distT="0" distB="0" distL="0" distR="0" wp14:anchorId="51CD5F6D" wp14:editId="0192948A">
                   <wp:extent cx="752209" cy="752209"/>
                   <wp:effectExtent l="0" t="0" r="0" b="0"/>
                   <wp:docPr id="1" name="Picture 1" descr="PESANTREN"/>
@@ -1084,18 +1084,57 @@
       </w:pPr>
       <w:r>
         <w:rPr>
+          <w:rFonts w:ascii="Bookman Old Style" w:hAnsi="Bookman Old Style" w:cs="Poppins"/>
+          <w:b/>
+          <w:bCs/>
+          <w:sz w:val="20"/>
+          <w:szCs w:val="20"/>
+          <w:lang w:val="en-ID"/>
+        </w:rPr>
+        <w:t>Keterangan:</w:t>
+      </w:r>
+      <w:r>
+        <w:rPr>
+          <w:rFonts w:ascii="Bookman Old Style" w:hAnsi="Bookman Old Style" w:cs="Poppins"/>
+          <w:sz w:val="20"/>
+          <w:szCs w:val="20"/>
+          <w:lang w:val="en-ID"/>
+        </w:rPr>
+        <w:t xml:space="preserve"> Bagi santri yang dengan sengaja tidak mengindahkan dan atau mematuhi tata tertib diatas akan dikenakan sanksi</w:t>
+      </w:r>
+      <w:r>
+        <w:rPr>
+          <w:rFonts w:ascii="Bookman Old Style" w:hAnsi="Bookman Old Style" w:cs="Poppins"/>
+          <w:sz w:val="20"/>
+          <w:szCs w:val="20"/>
+          <w:lang w:val="en-ID"/>
+        </w:rPr>
+        <w:t>.</w:t>
+      </w:r>
+    </w:p>
+    <w:p>
+      <w:pPr>
+        <w:rPr>
+          <w:rFonts w:ascii="Bookman Old Style" w:hAnsi="Bookman Old Style" w:cs="Poppins"/>
+          <w:sz w:val="20"/>
+          <w:szCs w:val="20"/>
+          <w:lang w:val="en-ID"/>
+        </w:rPr>
+      </w:pPr>
+      <w:r>
+        <w:rPr>
           <w:rFonts w:ascii="Bookman Old Style" w:hAnsi="Bookman Old Style"/>
           <w:noProof/>
           <w:lang w:val="en-ID"/>
         </w:rPr>
         <w:drawing>
-          <wp:anchor distT="0" distB="0" distL="114300" distR="114300" simplePos="0" relativeHeight="251661312" behindDoc="0" locked="0" layoutInCell="1" allowOverlap="1" wp14:anchorId="4E7BB869" wp14:editId="54BA19AF">
+          <wp:anchor distT="0" distB="0" distL="114300" distR="114300" simplePos="0" relativeHeight="251661312" behindDoc="0" locked="0" layoutInCell="1" allowOverlap="1" wp14:anchorId="4E7BB869" wp14:editId="2B1FD574">
             <wp:simplePos x="0" y="0"/>
             <wp:positionH relativeFrom="column">
-              <wp:posOffset>3220279</wp:posOffset>
+              <wp:posOffset>3220085</wp:posOffset>
             </wp:positionH>
             <wp:positionV relativeFrom="paragraph">
-              <wp:posOffset>290913</wp:posOffset>
+              <wp:posOffset>36004</wp:posOffset>
             </wp:positionV>
             <wp:extent cx="2684145" cy="1426210"/>
             <wp:effectExtent l="0" t="0" r="0" b="0"/>
@@ -1143,35 +1182,6 @@
             </wp14:sizeRelV>
           </wp:anchor>
         </w:drawing>
-      </w:r>
-      <w:r>
-        <w:rPr>
-          <w:rFonts w:ascii="Bookman Old Style" w:hAnsi="Bookman Old Style" w:cs="Poppins"/>
-          <w:b/>
-          <w:bCs/>
-          <w:sz w:val="20"/>
-          <w:szCs w:val="20"/>
-          <w:lang w:val="en-ID"/>
-        </w:rPr>
-        <w:t>Keterangan:</w:t>
-      </w:r>
-      <w:r>
-        <w:rPr>
-          <w:rFonts w:ascii="Bookman Old Style" w:hAnsi="Bookman Old Style" w:cs="Poppins"/>
-          <w:sz w:val="20"/>
-          <w:szCs w:val="20"/>
-          <w:lang w:val="en-ID"/>
-        </w:rPr>
-        <w:t xml:space="preserve"> Bagi santri yang dengan sengaja tidak mengindahkan dan atau mematuhi tata tertib diatas akan dikenakan sanksi</w:t>
-      </w:r>
-      <w:r>
-        <w:rPr>
-          <w:rFonts w:ascii="Bookman Old Style" w:hAnsi="Bookman Old Style" w:cs="Poppins"/>
-          <w:sz w:val="20"/>
-          <w:szCs w:val="20"/>
-          <w:lang w:val="en-ID"/>
-        </w:rPr>
-        <w:t>.</w:t>
       </w:r>
     </w:p>
     <w:p>
@@ -1332,8 +1342,21 @@
           <w:szCs w:val="20"/>
           <w:lang w:val="en-ID"/>
         </w:rPr>
-        <w:t>KH. Hasan Manshur, S.Pd.I</w:t>
-      </w:r>
+        <w:t>KH. Hasan Manshur, S.</w:t>
+      </w:r>
+      <w:proofErr w:type="gramStart"/>
+      <w:r>
+        <w:rPr>
+          <w:rFonts w:ascii="Bookman Old Style" w:hAnsi="Bookman Old Style" w:cs="Poppins"/>
+          <w:b/>
+          <w:bCs/>
+          <w:sz w:val="20"/>
+          <w:szCs w:val="20"/>
+          <w:lang w:val="en-ID"/>
+        </w:rPr>
+        <w:t>Pd.I</w:t>
+      </w:r>
+      <w:proofErr w:type="gramEnd"/>
     </w:p>
     <w:sectPr>
       <w:pgSz w:w="11906" w:h="16838" w:code="9"/>
@@ -1346,7 +1369,7 @@
 </file>
 
 <file path=word/numbering.xml><?xml version="1.0" encoding="utf-8"?>
-<w:numbering xmlns:wpc="http://schemas.microsoft.com/office/word/2010/wordprocessingCanvas" xmlns:cx="http://schemas.microsoft.com/office/drawing/2014/chartex" xmlns:cx1="http://schemas.microsoft.com/office/drawing/2015/9/8/chartex" xmlns:cx2="http://schemas.microsoft.com/office/drawing/2015/10/21/chartex" xmlns:cx3="http://schemas.microsoft.com/office/drawing/2016/5/9/chartex" xmlns:cx4="http://schemas.microsoft.com/office/drawing/2016/5/10/chartex" xmlns:cx5="http://schemas.microsoft.com/office/drawing/2016/5/11/chartex" xmlns:cx6="http://schemas.microsoft.com/office/drawing/2016/5/12/chartex" xmlns:cx7="http://schemas.microsoft.com/office/drawing/2016/5/13/chartex" xmlns:cx8="http://schemas.microsoft.com/office/drawing/2016/5/14/chartex" xmlns:mc="http://schemas.openxmlformats.org/markup-compatibility/2006" xmlns:aink="http://schemas.microsoft.com/office/drawing/2016/ink" xmlns:am3d="http://schemas.microsoft.com/office/drawing/2017/model3d" xmlns:o="urn:schemas-microsoft-com:office:office" xmlns:oel="http://schemas.microsoft.com/office/2019/extlst" xmlns:r="http://schemas.openxmlformats.org/officeDocument/2006/relationships" xmlns:m="http://schemas.openxmlformats.org/officeDocument/2006/math" xmlns:v="urn:schemas-microsoft-com:vml" xmlns:wp14="http://schemas.microsoft.com/office/word/2010/wordprocessingDrawing" xmlns:wp="http://schemas.openxmlformats.org/drawingml/2006/wordprocessingDrawing" xmlns:w10="urn:schemas-microsoft-com:office:word" xmlns:w="http://schemas.openxmlformats.org/wordprocessingml/2006/main" xmlns:w14="http://schemas.microsoft.com/office/word/2010/wordml" xmlns:w15="http://schemas.microsoft.com/office/word/2012/wordml" xmlns:w16cex="http://schemas.microsoft.com/office/word/2018/wordml/cex" xmlns:w16cid="http://schemas.microsoft.com/office/word/2016/wordml/cid" xmlns:w16="http://schemas.microsoft.com/office/word/2018/wordml" xmlns:w16du="http://schemas.microsoft.com/office/word/2023/wordml/word16du" xmlns:w16sdtdh="http://schemas.microsoft.com/office/word/2020/wordml/sdtdatahash" xmlns:w16se="http://schemas.microsoft.com/office/word/2015/wordml/symex" xmlns:wpg="http://schemas.microsoft.com/office/word/2010/wordprocessingGroup" xmlns:wpi="http://schemas.microsoft.com/office/word/2010/wordprocessingInk" xmlns:wne="http://schemas.microsoft.com/office/word/2006/wordml" xmlns:wps="http://schemas.microsoft.com/office/word/2010/wordprocessingShape" mc:Ignorable="w14 w15 w16se w16cid w16 w16cex w16sdtdh wp14">
+<w:numbering xmlns:wpc="http://schemas.microsoft.com/office/word/2010/wordprocessingCanvas" xmlns:cx="http://schemas.microsoft.com/office/drawing/2014/chartex" xmlns:cx1="http://schemas.microsoft.com/office/drawing/2015/9/8/chartex" xmlns:cx2="http://schemas.microsoft.com/office/drawing/2015/10/21/chartex" xmlns:cx3="http://schemas.microsoft.com/office/drawing/2016/5/9/chartex" xmlns:cx4="http://schemas.microsoft.com/office/drawing/2016/5/10/chartex" xmlns:cx5="http://schemas.microsoft.com/office/drawing/2016/5/11/chartex" xmlns:cx6="http://schemas.microsoft.com/office/drawing/2016/5/12/chartex" xmlns:cx7="http://schemas.microsoft.com/office/drawing/2016/5/13/chartex" xmlns:cx8="http://schemas.microsoft.com/office/drawing/2016/5/14/chartex" xmlns:mc="http://schemas.openxmlformats.org/markup-compatibility/2006" xmlns:aink="http://schemas.microsoft.com/office/drawing/2016/ink" xmlns:am3d="http://schemas.microsoft.com/office/drawing/2017/model3d" xmlns:o="urn:schemas-microsoft-com:office:office" xmlns:oel="http://schemas.microsoft.com/office/2019/extlst" xmlns:r="http://schemas.openxmlformats.org/officeDocument/2006/relationships" xmlns:m="http://schemas.openxmlformats.org/officeDocument/2006/math" xmlns:v="urn:schemas-microsoft-com:vml" xmlns:wp14="http://schemas.microsoft.com/office/word/2010/wordprocessingDrawing" xmlns:wp="http://schemas.openxmlformats.org/drawingml/2006/wordprocessingDrawing" xmlns:w10="urn:schemas-microsoft-com:office:word" xmlns:w="http://schemas.openxmlformats.org/wordprocessingml/2006/main" xmlns:w14="http://schemas.microsoft.com/office/word/2010/wordml" xmlns:w15="http://schemas.microsoft.com/office/word/2012/wordml" xmlns:w16cex="http://schemas.microsoft.com/office/word/2018/wordml/cex" xmlns:w16cid="http://schemas.microsoft.com/office/word/2016/wordml/cid" xmlns:w16="http://schemas.microsoft.com/office/word/2018/wordml" xmlns:w16du="http://schemas.microsoft.com/office/word/2023/wordml/word16du" xmlns:w16sdtdh="http://schemas.microsoft.com/office/word/2020/wordml/sdtdatahash" xmlns:w16sdtfl="http://schemas.microsoft.com/office/word/2024/wordml/sdtformatlock" xmlns:w16se="http://schemas.microsoft.com/office/word/2015/wordml/symex" xmlns:wpg="http://schemas.microsoft.com/office/word/2010/wordprocessingGroup" xmlns:wpi="http://schemas.microsoft.com/office/word/2010/wordprocessingInk" xmlns:wne="http://schemas.microsoft.com/office/word/2006/wordml" xmlns:wps="http://schemas.microsoft.com/office/word/2010/wordprocessingShape" mc:Ignorable="w14 w15 w16se w16cid w16 w16cex w16sdtdh w16sdtfl w16du wp14">
   <w:abstractNum w:abstractNumId="0" w15:restartNumberingAfterBreak="0">
     <w:nsid w:val="07E928E7"/>
     <w:multiLevelType w:val="hybridMultilevel"/>
@@ -2085,7 +2108,7 @@
 </file>
 
 <file path=word/styles.xml><?xml version="1.0" encoding="utf-8"?>
-<w:styles xmlns:mc="http://schemas.openxmlformats.org/markup-compatibility/2006" xmlns:r="http://schemas.openxmlformats.org/officeDocument/2006/relationships" xmlns:w="http://schemas.openxmlformats.org/wordprocessingml/2006/main" xmlns:w14="http://schemas.microsoft.com/office/word/2010/wordml" xmlns:w15="http://schemas.microsoft.com/office/word/2012/wordml" xmlns:w16cex="http://schemas.microsoft.com/office/word/2018/wordml/cex" xmlns:w16cid="http://schemas.microsoft.com/office/word/2016/wordml/cid" xmlns:w16="http://schemas.microsoft.com/office/word/2018/wordml" xmlns:w16sdtdh="http://schemas.microsoft.com/office/word/2020/wordml/sdtdatahash" xmlns:w16se="http://schemas.microsoft.com/office/word/2015/wordml/symex" mc:Ignorable="w14 w15 w16se w16cid w16 w16cex w16sdtdh">
+<w:styles xmlns:mc="http://schemas.openxmlformats.org/markup-compatibility/2006" xmlns:r="http://schemas.openxmlformats.org/officeDocument/2006/relationships" xmlns:w="http://schemas.openxmlformats.org/wordprocessingml/2006/main" xmlns:w14="http://schemas.microsoft.com/office/word/2010/wordml" xmlns:w15="http://schemas.microsoft.com/office/word/2012/wordml" xmlns:w16cex="http://schemas.microsoft.com/office/word/2018/wordml/cex" xmlns:w16cid="http://schemas.microsoft.com/office/word/2016/wordml/cid" xmlns:w16="http://schemas.microsoft.com/office/word/2018/wordml" xmlns:w16du="http://schemas.microsoft.com/office/word/2023/wordml/word16du" xmlns:w16sdtdh="http://schemas.microsoft.com/office/word/2020/wordml/sdtdatahash" xmlns:w16sdtfl="http://schemas.microsoft.com/office/word/2024/wordml/sdtformatlock" xmlns:w16se="http://schemas.microsoft.com/office/word/2015/wordml/symex" mc:Ignorable="w14 w15 w16se w16cid w16 w16cex w16sdtdh w16sdtfl w16du">
   <w:docDefaults>
     <w:rPrDefault>
       <w:rPr>

</xml_diff>